<commit_message>
Adicionando manual de instalação atualizado
</commit_message>
<xml_diff>
--- a/Manual de Instalação.docx
+++ b/Manual de Instalação.docx
@@ -2,7 +2,7 @@
 <file path=word/document.xml><?xml version="1.0" encoding="utf-8"?>
 <w:document xmlns:wpc="http://schemas.microsoft.com/office/word/2010/wordprocessingCanvas" xmlns:mc="http://schemas.openxmlformats.org/markup-compatibility/2006" xmlns:o="urn:schemas-microsoft-com:office:office" xmlns:r="http://schemas.openxmlformats.org/officeDocument/2006/relationships" xmlns:m="http://schemas.openxmlformats.org/officeDocument/2006/math" xmlns:v="urn:schemas-microsoft-com:vml" xmlns:wp14="http://schemas.microsoft.com/office/word/2010/wordprocessingDrawing" xmlns:wp="http://schemas.openxmlformats.org/drawingml/2006/wordprocessingDrawing" xmlns:w10="urn:schemas-microsoft-com:office:word" xmlns:w="http://schemas.openxmlformats.org/wordprocessingml/2006/main" xmlns:w14="http://schemas.microsoft.com/office/word/2010/wordml" xmlns:w15="http://schemas.microsoft.com/office/word/2012/wordml" xmlns:wpg="http://schemas.microsoft.com/office/word/2010/wordprocessingGroup" xmlns:wpi="http://schemas.microsoft.com/office/word/2010/wordprocessingInk" xmlns:wne="http://schemas.microsoft.com/office/word/2006/wordml" xmlns:wps="http://schemas.microsoft.com/office/word/2010/wordprocessingShape" xmlns:w16se="http://schemas.microsoft.com/office/word/2015/wordml/symex" xmlns:w16cid="http://schemas.microsoft.com/office/word/2016/wordml/cid" xmlns:w16="http://schemas.microsoft.com/office/word/2018/wordml" xmlns:w16cex="http://schemas.microsoft.com/office/word/2018/wordml/cex" xmlns:w16sdtdh="http://schemas.microsoft.com/office/word/2020/wordml/sdtdatahash" xmlns:w16sdtfl="http://schemas.microsoft.com/office/word/2024/wordml/sdtformatlock" mc:Ignorable="w14 w15 wp14 w16se w16cid w16 w16cex w16sdtdh w16sdtfl">
   <w:body>
-    <w:p xmlns:wp14="http://schemas.microsoft.com/office/word/2010/wordml" wp14:paraId="5ECCB5D1" wp14:textId="0B9579BE">
+    <w:p>
       <w:pPr>
         <w:pStyle w:val="Heading1"/>
         <w:spacing w:before="320" w:after="160"/>
@@ -19,7 +19,7 @@
           <w:color w:val="auto"/>
           <w:sz w:val="48"/>
           <w:szCs w:val="48"/>
-          <w:lang w:val="pt-BR"/>
+          <w:lang w:val="en-US"/>
         </w:rPr>
       </w:pPr>
       <w:r>
@@ -37,7 +37,1468 @@
           <w:szCs w:val="48"/>
           <w:lang w:val="en-US"/>
         </w:rPr>
-        <w:t>Manual de Instalação</w:t>
+        <w:t xml:space="preserve">Manual de </w:t>
+      </w:r>
+      <w:r>
+        <w:rPr>
+          <w:rFonts w:ascii="Arial" w:hAnsi="Arial" w:eastAsia="Arial" w:cs="Arial"/>
+          <w:b w:val="1"/>
+          <w:bCs w:val="1"/>
+          <w:i w:val="0"/>
+          <w:iCs w:val="0"/>
+          <w:caps w:val="0"/>
+          <w:smallCaps w:val="0"/>
+          <w:noProof w:val="0"/>
+          <w:color w:val="auto"/>
+          <w:sz w:val="48"/>
+          <w:szCs w:val="48"/>
+          <w:lang w:val="en-US"/>
+        </w:rPr>
+        <w:t>Instalaçã</w:t>
+      </w:r>
+      <w:r>
+        <w:rPr>
+          <w:rFonts w:ascii="Arial" w:hAnsi="Arial" w:eastAsia="Arial" w:cs="Arial"/>
+          <w:b w:val="1"/>
+          <w:bCs w:val="1"/>
+          <w:i w:val="0"/>
+          <w:iCs w:val="0"/>
+          <w:caps w:val="0"/>
+          <w:smallCaps w:val="0"/>
+          <w:noProof w:val="0"/>
+          <w:color w:val="auto"/>
+          <w:sz w:val="48"/>
+          <w:szCs w:val="48"/>
+          <w:lang w:val="en-US"/>
+        </w:rPr>
+        <w:t>o</w:t>
+      </w:r>
+      <w:r>
+        <w:rPr>
+          <w:rFonts w:ascii="Arial" w:hAnsi="Arial" w:eastAsia="Arial" w:cs="Arial"/>
+          <w:b w:val="1"/>
+          <w:bCs w:val="1"/>
+          <w:i w:val="0"/>
+          <w:iCs w:val="0"/>
+          <w:caps w:val="0"/>
+          <w:smallCaps w:val="0"/>
+          <w:noProof w:val="0"/>
+          <w:color w:val="auto"/>
+          <w:sz w:val="48"/>
+          <w:szCs w:val="48"/>
+          <w:lang w:val="en-US"/>
+        </w:rPr>
+        <w:t xml:space="preserve"> - WINESENSE</w:t>
+      </w:r>
+    </w:p>
+    <w:p>
+      <w:pPr>
+        <w:pStyle w:val="Normal"/>
+        <w:rPr>
+          <w:noProof w:val="0"/>
+          <w:lang w:val="en-US"/>
+        </w:rPr>
+      </w:pPr>
+    </w:p>
+    <w:p>
+      <w:pPr>
+        <w:pStyle w:val="Normal"/>
+        <w:rPr>
+          <w:noProof w:val="0"/>
+          <w:lang w:val="en-US"/>
+        </w:rPr>
+      </w:pPr>
+    </w:p>
+    <w:p>
+      <w:pPr>
+        <w:pStyle w:val="Heading1"/>
+        <w:rPr>
+          <w:noProof w:val="0"/>
+          <w:lang w:val="en-US"/>
+        </w:rPr>
+      </w:pPr>
+      <w:r>
+        <w:rPr>
+          <w:noProof w:val="0"/>
+          <w:lang w:val="en-US"/>
+        </w:rPr>
+        <w:t>Instalação</w:t>
+      </w:r>
+      <w:r>
+        <w:rPr>
+          <w:noProof w:val="0"/>
+          <w:lang w:val="en-US"/>
+        </w:rPr>
+        <w:t xml:space="preserve"> do Hardware:</w:t>
+      </w:r>
+    </w:p>
+    <w:p>
+      <w:pPr>
+        <w:pStyle w:val="Heading2"/>
+        <w:rPr>
+          <w:rFonts w:ascii="Arial" w:hAnsi="Arial" w:eastAsia="Arial" w:cs="Arial"/>
+          <w:b w:val="1"/>
+          <w:bCs w:val="1"/>
+          <w:i w:val="0"/>
+          <w:iCs w:val="0"/>
+          <w:noProof w:val="0"/>
+          <w:sz w:val="28"/>
+          <w:szCs w:val="28"/>
+          <w:lang w:val="en-US"/>
+        </w:rPr>
+      </w:pPr>
+      <w:r>
+        <w:rPr>
+          <w:rFonts w:ascii="Arial" w:hAnsi="Arial" w:eastAsia="Arial" w:cs="Arial"/>
+          <w:b w:val="1"/>
+          <w:bCs w:val="1"/>
+          <w:i w:val="0"/>
+          <w:iCs w:val="0"/>
+          <w:noProof w:val="0"/>
+          <w:sz w:val="28"/>
+          <w:szCs w:val="28"/>
+          <w:lang w:val="en-US"/>
+        </w:rPr>
+        <w:t>1. Pré-requisitos e Componentes</w:t>
+      </w:r>
+    </w:p>
+    <w:p>
+      <w:pPr>
+        <w:spacing w:before="360" w:beforeAutospacing="off" w:after="180" w:afterAutospacing="off"/>
+      </w:pPr>
+      <w:r>
+        <w:rPr>
+          <w:rFonts w:ascii="Arial" w:hAnsi="Arial" w:eastAsia="Arial" w:cs="Arial"/>
+          <w:b w:val="1"/>
+          <w:bCs w:val="1"/>
+          <w:strike w:val="0"/>
+          <w:dstrike w:val="0"/>
+          <w:noProof w:val="0"/>
+          <w:sz w:val="30"/>
+          <w:szCs w:val="30"/>
+          <w:u w:val="none"/>
+          <w:lang w:val="en-US"/>
+        </w:rPr>
+        <w:t>Hardware Necessário</w:t>
+      </w:r>
+    </w:p>
+    <w:p>
+      <w:pPr>
+        <w:pStyle w:val="ListParagraph"/>
+        <w:numPr>
+          <w:ilvl w:val="0"/>
+          <w:numId w:val="19"/>
+        </w:numPr>
+        <w:spacing w:before="180" w:beforeAutospacing="off" w:after="240" w:afterAutospacing="off"/>
+        <w:rPr>
+          <w:rFonts w:ascii="Arial" w:hAnsi="Arial" w:eastAsia="Arial" w:cs="Arial"/>
+          <w:b w:val="0"/>
+          <w:bCs w:val="0"/>
+          <w:strike w:val="0"/>
+          <w:dstrike w:val="0"/>
+          <w:noProof w:val="0"/>
+          <w:sz w:val="24"/>
+          <w:szCs w:val="24"/>
+          <w:u w:val="none"/>
+          <w:lang w:val="en-US"/>
+        </w:rPr>
+      </w:pPr>
+      <w:r>
+        <w:rPr>
+          <w:rFonts w:ascii="Arial" w:hAnsi="Arial" w:eastAsia="Arial" w:cs="Arial"/>
+          <w:b w:val="1"/>
+          <w:bCs w:val="1"/>
+          <w:strike w:val="0"/>
+          <w:dstrike w:val="0"/>
+          <w:noProof w:val="0"/>
+          <w:sz w:val="24"/>
+          <w:szCs w:val="24"/>
+          <w:u w:val="none"/>
+          <w:lang w:val="en-US"/>
+        </w:rPr>
+        <w:t>Sensor de Temperatura</w:t>
+      </w:r>
+      <w:r>
+        <w:rPr>
+          <w:rFonts w:ascii="Arial" w:hAnsi="Arial" w:eastAsia="Arial" w:cs="Arial"/>
+          <w:b w:val="0"/>
+          <w:bCs w:val="0"/>
+          <w:strike w:val="0"/>
+          <w:dstrike w:val="0"/>
+          <w:noProof w:val="0"/>
+          <w:sz w:val="24"/>
+          <w:szCs w:val="24"/>
+          <w:u w:val="none"/>
+          <w:lang w:val="en-US"/>
+        </w:rPr>
+        <w:t>: Modelo LM35 (precisão de duas casas decimais) (p. 6).</w:t>
+      </w:r>
+    </w:p>
+    <w:p>
+      <w:pPr>
+        <w:pStyle w:val="ListParagraph"/>
+        <w:numPr>
+          <w:ilvl w:val="0"/>
+          <w:numId w:val="19"/>
+        </w:numPr>
+        <w:spacing w:before="180" w:beforeAutospacing="off" w:after="240" w:afterAutospacing="off"/>
+        <w:rPr>
+          <w:rFonts w:ascii="Arial" w:hAnsi="Arial" w:eastAsia="Arial" w:cs="Arial"/>
+          <w:b w:val="0"/>
+          <w:bCs w:val="0"/>
+          <w:strike w:val="0"/>
+          <w:dstrike w:val="0"/>
+          <w:noProof w:val="0"/>
+          <w:sz w:val="24"/>
+          <w:szCs w:val="24"/>
+          <w:u w:val="none"/>
+          <w:lang w:val="en-US"/>
+        </w:rPr>
+      </w:pPr>
+      <w:r>
+        <w:rPr>
+          <w:rFonts w:ascii="Arial" w:hAnsi="Arial" w:eastAsia="Arial" w:cs="Arial"/>
+          <w:b w:val="1"/>
+          <w:bCs w:val="1"/>
+          <w:strike w:val="0"/>
+          <w:dstrike w:val="0"/>
+          <w:noProof w:val="0"/>
+          <w:sz w:val="24"/>
+          <w:szCs w:val="24"/>
+          <w:u w:val="none"/>
+          <w:lang w:val="en-US"/>
+        </w:rPr>
+        <w:t>Microcontrolador</w:t>
+      </w:r>
+      <w:r>
+        <w:rPr>
+          <w:rFonts w:ascii="Arial" w:hAnsi="Arial" w:eastAsia="Arial" w:cs="Arial"/>
+          <w:b w:val="0"/>
+          <w:bCs w:val="0"/>
+          <w:strike w:val="0"/>
+          <w:dstrike w:val="0"/>
+          <w:noProof w:val="0"/>
+          <w:sz w:val="24"/>
+          <w:szCs w:val="24"/>
+          <w:u w:val="none"/>
+          <w:lang w:val="en-US"/>
+        </w:rPr>
+        <w:t>: Placa Arduino (Uno ou similar com interface USB) (pp. 4, 9).</w:t>
+      </w:r>
+    </w:p>
+    <w:p>
+      <w:pPr>
+        <w:pStyle w:val="ListParagraph"/>
+        <w:numPr>
+          <w:ilvl w:val="0"/>
+          <w:numId w:val="19"/>
+        </w:numPr>
+        <w:spacing w:before="180" w:beforeAutospacing="off" w:after="240" w:afterAutospacing="off"/>
+        <w:rPr>
+          <w:rFonts w:ascii="Arial" w:hAnsi="Arial" w:eastAsia="Arial" w:cs="Arial"/>
+          <w:b w:val="0"/>
+          <w:bCs w:val="0"/>
+          <w:strike w:val="0"/>
+          <w:dstrike w:val="0"/>
+          <w:noProof w:val="0"/>
+          <w:sz w:val="24"/>
+          <w:szCs w:val="24"/>
+          <w:u w:val="none"/>
+          <w:lang w:val="en-US"/>
+        </w:rPr>
+      </w:pPr>
+      <w:r>
+        <w:rPr>
+          <w:rFonts w:ascii="Arial" w:hAnsi="Arial" w:eastAsia="Arial" w:cs="Arial"/>
+          <w:b w:val="1"/>
+          <w:bCs w:val="1"/>
+          <w:strike w:val="0"/>
+          <w:dstrike w:val="0"/>
+          <w:noProof w:val="0"/>
+          <w:sz w:val="24"/>
+          <w:szCs w:val="24"/>
+          <w:u w:val="none"/>
+          <w:lang w:val="en-US"/>
+        </w:rPr>
+        <w:t>Conetividade</w:t>
+      </w:r>
+      <w:r>
+        <w:rPr>
+          <w:rFonts w:ascii="Arial" w:hAnsi="Arial" w:eastAsia="Arial" w:cs="Arial"/>
+          <w:b w:val="0"/>
+          <w:bCs w:val="0"/>
+          <w:strike w:val="0"/>
+          <w:dstrike w:val="0"/>
+          <w:noProof w:val="0"/>
+          <w:sz w:val="24"/>
+          <w:szCs w:val="24"/>
+          <w:u w:val="none"/>
+          <w:lang w:val="en-US"/>
+        </w:rPr>
+        <w:t>: Cabo de dados USB e fios condutores (jumper) (pp. 4, 10).</w:t>
+      </w:r>
+    </w:p>
+    <w:p>
+      <w:pPr>
+        <w:pStyle w:val="ListParagraph"/>
+        <w:numPr>
+          <w:ilvl w:val="0"/>
+          <w:numId w:val="19"/>
+        </w:numPr>
+        <w:spacing w:before="180" w:beforeAutospacing="off" w:after="240" w:afterAutospacing="off"/>
+        <w:rPr>
+          <w:rFonts w:ascii="Arial" w:hAnsi="Arial" w:eastAsia="Arial" w:cs="Arial"/>
+          <w:b w:val="0"/>
+          <w:bCs w:val="0"/>
+          <w:strike w:val="0"/>
+          <w:dstrike w:val="0"/>
+          <w:noProof w:val="0"/>
+          <w:sz w:val="24"/>
+          <w:szCs w:val="24"/>
+          <w:u w:val="none"/>
+          <w:lang w:val="en-US"/>
+        </w:rPr>
+      </w:pPr>
+      <w:r>
+        <w:rPr>
+          <w:rFonts w:ascii="Arial" w:hAnsi="Arial" w:eastAsia="Arial" w:cs="Arial"/>
+          <w:b w:val="1"/>
+          <w:bCs w:val="1"/>
+          <w:strike w:val="0"/>
+          <w:dstrike w:val="0"/>
+          <w:noProof w:val="0"/>
+          <w:sz w:val="24"/>
+          <w:szCs w:val="24"/>
+          <w:u w:val="none"/>
+          <w:lang w:val="en-US"/>
+        </w:rPr>
+        <w:t>Proteção</w:t>
+      </w:r>
+      <w:r>
+        <w:rPr>
+          <w:rFonts w:ascii="Arial" w:hAnsi="Arial" w:eastAsia="Arial" w:cs="Arial"/>
+          <w:b w:val="0"/>
+          <w:bCs w:val="0"/>
+          <w:strike w:val="0"/>
+          <w:dstrike w:val="0"/>
+          <w:noProof w:val="0"/>
+          <w:sz w:val="24"/>
+          <w:szCs w:val="24"/>
+          <w:u w:val="none"/>
+          <w:lang w:val="en-US"/>
+        </w:rPr>
+        <w:t>: Poço termométrico ou encapsulamento estanque (impermeável).</w:t>
+      </w:r>
+    </w:p>
+    <w:p>
+      <w:pPr>
+        <w:pStyle w:val="ListParagraph"/>
+        <w:numPr>
+          <w:ilvl w:val="0"/>
+          <w:numId w:val="19"/>
+        </w:numPr>
+        <w:spacing w:before="180" w:beforeAutospacing="off" w:after="240" w:afterAutospacing="off"/>
+        <w:rPr>
+          <w:rFonts w:ascii="Arial" w:hAnsi="Arial" w:eastAsia="Arial" w:cs="Arial"/>
+          <w:b w:val="0"/>
+          <w:bCs w:val="0"/>
+          <w:strike w:val="0"/>
+          <w:dstrike w:val="0"/>
+          <w:noProof w:val="0"/>
+          <w:sz w:val="24"/>
+          <w:szCs w:val="24"/>
+          <w:u w:val="none"/>
+          <w:lang w:val="en-US"/>
+        </w:rPr>
+      </w:pPr>
+      <w:r>
+        <w:rPr>
+          <w:rFonts w:ascii="Arial" w:hAnsi="Arial" w:eastAsia="Arial" w:cs="Arial"/>
+          <w:b w:val="1"/>
+          <w:bCs w:val="1"/>
+          <w:strike w:val="0"/>
+          <w:dstrike w:val="0"/>
+          <w:noProof w:val="0"/>
+          <w:sz w:val="24"/>
+          <w:szCs w:val="24"/>
+          <w:u w:val="none"/>
+          <w:lang w:val="en-US"/>
+        </w:rPr>
+        <w:t>Infraestrutura</w:t>
+      </w:r>
+      <w:r>
+        <w:rPr>
+          <w:rFonts w:ascii="Arial" w:hAnsi="Arial" w:eastAsia="Arial" w:cs="Arial"/>
+          <w:b w:val="0"/>
+          <w:bCs w:val="0"/>
+          <w:strike w:val="0"/>
+          <w:dstrike w:val="0"/>
+          <w:noProof w:val="0"/>
+          <w:sz w:val="24"/>
+          <w:szCs w:val="24"/>
+          <w:u w:val="none"/>
+          <w:lang w:val="en-US"/>
+        </w:rPr>
+        <w:t>: Computador com ligação à Internet na vinícola (p. 5).</w:t>
+      </w:r>
+    </w:p>
+    <w:p>
+      <w:pPr>
+        <w:spacing w:before="360" w:beforeAutospacing="off" w:after="180" w:afterAutospacing="off"/>
+        <w:rPr>
+          <w:rFonts w:ascii="Arial" w:hAnsi="Arial" w:eastAsia="Arial" w:cs="Arial"/>
+          <w:b w:val="1"/>
+          <w:bCs w:val="1"/>
+          <w:strike w:val="0"/>
+          <w:dstrike w:val="0"/>
+          <w:noProof w:val="0"/>
+          <w:sz w:val="28"/>
+          <w:szCs w:val="28"/>
+          <w:u w:val="none"/>
+          <w:lang w:val="en-US"/>
+        </w:rPr>
+      </w:pPr>
+      <w:r>
+        <w:rPr>
+          <w:rFonts w:ascii="Arial" w:hAnsi="Arial" w:eastAsia="Arial" w:cs="Arial"/>
+          <w:b w:val="1"/>
+          <w:bCs w:val="1"/>
+          <w:strike w:val="0"/>
+          <w:dstrike w:val="0"/>
+          <w:noProof w:val="0"/>
+          <w:sz w:val="28"/>
+          <w:szCs w:val="28"/>
+          <w:u w:val="none"/>
+          <w:lang w:val="en-US"/>
+        </w:rPr>
+        <w:t>2. Instalação Física e Conexões (Hardware)</w:t>
+      </w:r>
+    </w:p>
+    <w:p>
+      <w:pPr>
+        <w:spacing w:before="0" w:beforeAutospacing="off" w:after="0" w:afterAutospacing="off"/>
+      </w:pPr>
+      <w:r>
+        <w:rPr>
+          <w:rFonts w:ascii="Arial" w:hAnsi="Arial" w:eastAsia="Arial" w:cs="Arial"/>
+          <w:b w:val="1"/>
+          <w:bCs w:val="1"/>
+          <w:strike w:val="0"/>
+          <w:dstrike w:val="0"/>
+          <w:noProof w:val="0"/>
+          <w:sz w:val="24"/>
+          <w:szCs w:val="24"/>
+          <w:u w:val="none"/>
+          <w:lang w:val="en-US"/>
+        </w:rPr>
+        <w:t xml:space="preserve">Aviso de </w:t>
+      </w:r>
+      <w:r>
+        <w:rPr>
+          <w:rFonts w:ascii="Arial" w:hAnsi="Arial" w:eastAsia="Arial" w:cs="Arial"/>
+          <w:b w:val="1"/>
+          <w:bCs w:val="1"/>
+          <w:strike w:val="0"/>
+          <w:dstrike w:val="0"/>
+          <w:noProof w:val="0"/>
+          <w:sz w:val="24"/>
+          <w:szCs w:val="24"/>
+          <w:u w:val="none"/>
+          <w:lang w:val="en-US"/>
+        </w:rPr>
+        <w:t>Segurança</w:t>
+      </w:r>
+      <w:r>
+        <w:rPr>
+          <w:rFonts w:ascii="Arial" w:hAnsi="Arial" w:eastAsia="Arial" w:cs="Arial"/>
+          <w:b w:val="0"/>
+          <w:bCs w:val="0"/>
+          <w:strike w:val="0"/>
+          <w:dstrike w:val="0"/>
+          <w:noProof w:val="0"/>
+          <w:sz w:val="24"/>
+          <w:szCs w:val="24"/>
+          <w:u w:val="none"/>
+          <w:lang w:val="en-US"/>
+        </w:rPr>
+        <w:t xml:space="preserve">: O sensor LM35 </w:t>
+      </w:r>
+      <w:r>
+        <w:rPr>
+          <w:rFonts w:ascii="Arial" w:hAnsi="Arial" w:eastAsia="Arial" w:cs="Arial"/>
+          <w:b w:val="1"/>
+          <w:bCs w:val="1"/>
+          <w:strike w:val="0"/>
+          <w:dstrike w:val="0"/>
+          <w:noProof w:val="0"/>
+          <w:sz w:val="24"/>
+          <w:szCs w:val="24"/>
+          <w:u w:val="none"/>
+          <w:lang w:val="en-US"/>
+        </w:rPr>
+        <w:t>não</w:t>
+      </w:r>
+      <w:r>
+        <w:rPr>
+          <w:rFonts w:ascii="Arial" w:hAnsi="Arial" w:eastAsia="Arial" w:cs="Arial"/>
+          <w:b w:val="0"/>
+          <w:bCs w:val="0"/>
+          <w:strike w:val="0"/>
+          <w:dstrike w:val="0"/>
+          <w:noProof w:val="0"/>
+          <w:sz w:val="24"/>
+          <w:szCs w:val="24"/>
+          <w:u w:val="none"/>
+          <w:lang w:val="en-US"/>
+        </w:rPr>
+        <w:t xml:space="preserve"> </w:t>
+      </w:r>
+      <w:r>
+        <w:rPr>
+          <w:rFonts w:ascii="Arial" w:hAnsi="Arial" w:eastAsia="Arial" w:cs="Arial"/>
+          <w:b w:val="0"/>
+          <w:bCs w:val="0"/>
+          <w:strike w:val="0"/>
+          <w:dstrike w:val="0"/>
+          <w:noProof w:val="0"/>
+          <w:sz w:val="24"/>
+          <w:szCs w:val="24"/>
+          <w:u w:val="none"/>
+          <w:lang w:val="en-US"/>
+        </w:rPr>
+        <w:t>pode</w:t>
+      </w:r>
+      <w:r>
+        <w:rPr>
+          <w:rFonts w:ascii="Arial" w:hAnsi="Arial" w:eastAsia="Arial" w:cs="Arial"/>
+          <w:b w:val="0"/>
+          <w:bCs w:val="0"/>
+          <w:strike w:val="0"/>
+          <w:dstrike w:val="0"/>
+          <w:noProof w:val="0"/>
+          <w:sz w:val="24"/>
+          <w:szCs w:val="24"/>
+          <w:u w:val="none"/>
+          <w:lang w:val="en-US"/>
+        </w:rPr>
+        <w:t xml:space="preserve"> </w:t>
+      </w:r>
+      <w:r>
+        <w:rPr>
+          <w:rFonts w:ascii="Arial" w:hAnsi="Arial" w:eastAsia="Arial" w:cs="Arial"/>
+          <w:b w:val="0"/>
+          <w:bCs w:val="0"/>
+          <w:strike w:val="0"/>
+          <w:dstrike w:val="0"/>
+          <w:noProof w:val="0"/>
+          <w:sz w:val="24"/>
+          <w:szCs w:val="24"/>
+          <w:u w:val="none"/>
+          <w:lang w:val="en-US"/>
+        </w:rPr>
+        <w:t>entrar</w:t>
+      </w:r>
+      <w:r>
+        <w:rPr>
+          <w:rFonts w:ascii="Arial" w:hAnsi="Arial" w:eastAsia="Arial" w:cs="Arial"/>
+          <w:b w:val="0"/>
+          <w:bCs w:val="0"/>
+          <w:strike w:val="0"/>
+          <w:dstrike w:val="0"/>
+          <w:noProof w:val="0"/>
+          <w:sz w:val="24"/>
+          <w:szCs w:val="24"/>
+          <w:u w:val="none"/>
+          <w:lang w:val="en-US"/>
+        </w:rPr>
+        <w:t xml:space="preserve"> </w:t>
+      </w:r>
+      <w:r>
+        <w:rPr>
+          <w:rFonts w:ascii="Arial" w:hAnsi="Arial" w:eastAsia="Arial" w:cs="Arial"/>
+          <w:b w:val="0"/>
+          <w:bCs w:val="0"/>
+          <w:strike w:val="0"/>
+          <w:dstrike w:val="0"/>
+          <w:noProof w:val="0"/>
+          <w:sz w:val="24"/>
+          <w:szCs w:val="24"/>
+          <w:u w:val="none"/>
+          <w:lang w:val="en-US"/>
+        </w:rPr>
+        <w:t>em</w:t>
+      </w:r>
+      <w:r>
+        <w:rPr>
+          <w:rFonts w:ascii="Arial" w:hAnsi="Arial" w:eastAsia="Arial" w:cs="Arial"/>
+          <w:b w:val="0"/>
+          <w:bCs w:val="0"/>
+          <w:strike w:val="0"/>
+          <w:dstrike w:val="0"/>
+          <w:noProof w:val="0"/>
+          <w:sz w:val="24"/>
+          <w:szCs w:val="24"/>
+          <w:u w:val="none"/>
+          <w:lang w:val="en-US"/>
+        </w:rPr>
+        <w:t xml:space="preserve"> </w:t>
+      </w:r>
+      <w:r>
+        <w:rPr>
+          <w:rFonts w:ascii="Arial" w:hAnsi="Arial" w:eastAsia="Arial" w:cs="Arial"/>
+          <w:b w:val="0"/>
+          <w:bCs w:val="0"/>
+          <w:strike w:val="0"/>
+          <w:dstrike w:val="0"/>
+          <w:noProof w:val="0"/>
+          <w:sz w:val="24"/>
+          <w:szCs w:val="24"/>
+          <w:u w:val="none"/>
+          <w:lang w:val="en-US"/>
+        </w:rPr>
+        <w:t>contacto</w:t>
+      </w:r>
+      <w:r>
+        <w:rPr>
+          <w:rFonts w:ascii="Arial" w:hAnsi="Arial" w:eastAsia="Arial" w:cs="Arial"/>
+          <w:b w:val="0"/>
+          <w:bCs w:val="0"/>
+          <w:strike w:val="0"/>
+          <w:dstrike w:val="0"/>
+          <w:noProof w:val="0"/>
+          <w:sz w:val="24"/>
+          <w:szCs w:val="24"/>
+          <w:u w:val="none"/>
+          <w:lang w:val="en-US"/>
+        </w:rPr>
+        <w:t xml:space="preserve"> </w:t>
+      </w:r>
+      <w:r>
+        <w:rPr>
+          <w:rFonts w:ascii="Arial" w:hAnsi="Arial" w:eastAsia="Arial" w:cs="Arial"/>
+          <w:b w:val="0"/>
+          <w:bCs w:val="0"/>
+          <w:strike w:val="0"/>
+          <w:dstrike w:val="0"/>
+          <w:noProof w:val="0"/>
+          <w:sz w:val="24"/>
+          <w:szCs w:val="24"/>
+          <w:u w:val="none"/>
+          <w:lang w:val="en-US"/>
+        </w:rPr>
+        <w:t>direto</w:t>
+      </w:r>
+      <w:r>
+        <w:rPr>
+          <w:rFonts w:ascii="Arial" w:hAnsi="Arial" w:eastAsia="Arial" w:cs="Arial"/>
+          <w:b w:val="0"/>
+          <w:bCs w:val="0"/>
+          <w:strike w:val="0"/>
+          <w:dstrike w:val="0"/>
+          <w:noProof w:val="0"/>
+          <w:sz w:val="24"/>
+          <w:szCs w:val="24"/>
+          <w:u w:val="none"/>
+          <w:lang w:val="en-US"/>
+        </w:rPr>
+        <w:t xml:space="preserve"> com o vinho </w:t>
+      </w:r>
+      <w:r>
+        <w:rPr>
+          <w:rFonts w:ascii="Arial" w:hAnsi="Arial" w:eastAsia="Arial" w:cs="Arial"/>
+          <w:b w:val="0"/>
+          <w:bCs w:val="0"/>
+          <w:strike w:val="0"/>
+          <w:dstrike w:val="0"/>
+          <w:noProof w:val="0"/>
+          <w:sz w:val="24"/>
+          <w:szCs w:val="24"/>
+          <w:u w:val="none"/>
+          <w:lang w:val="en-US"/>
+        </w:rPr>
+        <w:t>ou</w:t>
+      </w:r>
+      <w:r>
+        <w:rPr>
+          <w:rFonts w:ascii="Arial" w:hAnsi="Arial" w:eastAsia="Arial" w:cs="Arial"/>
+          <w:b w:val="0"/>
+          <w:bCs w:val="0"/>
+          <w:strike w:val="0"/>
+          <w:dstrike w:val="0"/>
+          <w:noProof w:val="0"/>
+          <w:sz w:val="24"/>
+          <w:szCs w:val="24"/>
+          <w:u w:val="none"/>
+          <w:lang w:val="en-US"/>
+        </w:rPr>
+        <w:t xml:space="preserve"> com o </w:t>
+      </w:r>
+      <w:r>
+        <w:rPr>
+          <w:rFonts w:ascii="Arial" w:hAnsi="Arial" w:eastAsia="Arial" w:cs="Arial"/>
+          <w:b w:val="0"/>
+          <w:bCs w:val="0"/>
+          <w:strike w:val="0"/>
+          <w:dstrike w:val="0"/>
+          <w:noProof w:val="0"/>
+          <w:sz w:val="24"/>
+          <w:szCs w:val="24"/>
+          <w:u w:val="none"/>
+          <w:lang w:val="en-US"/>
+        </w:rPr>
+        <w:t>suco</w:t>
+      </w:r>
+      <w:r>
+        <w:rPr>
+          <w:rFonts w:ascii="Arial" w:hAnsi="Arial" w:eastAsia="Arial" w:cs="Arial"/>
+          <w:b w:val="0"/>
+          <w:bCs w:val="0"/>
+          <w:strike w:val="0"/>
+          <w:dstrike w:val="0"/>
+          <w:noProof w:val="0"/>
+          <w:sz w:val="24"/>
+          <w:szCs w:val="24"/>
+          <w:u w:val="none"/>
+          <w:lang w:val="en-US"/>
+        </w:rPr>
+        <w:t xml:space="preserve"> de uva </w:t>
+      </w:r>
+      <w:r>
+        <w:rPr>
+          <w:rFonts w:ascii="Arial" w:hAnsi="Arial" w:eastAsia="Arial" w:cs="Arial"/>
+          <w:b w:val="0"/>
+          <w:bCs w:val="0"/>
+          <w:strike w:val="0"/>
+          <w:dstrike w:val="0"/>
+          <w:noProof w:val="0"/>
+          <w:sz w:val="24"/>
+          <w:szCs w:val="24"/>
+          <w:u w:val="none"/>
+          <w:lang w:val="en-US"/>
+        </w:rPr>
+        <w:t>em</w:t>
+      </w:r>
+      <w:r>
+        <w:rPr>
+          <w:rFonts w:ascii="Arial" w:hAnsi="Arial" w:eastAsia="Arial" w:cs="Arial"/>
+          <w:b w:val="0"/>
+          <w:bCs w:val="0"/>
+          <w:strike w:val="0"/>
+          <w:dstrike w:val="0"/>
+          <w:noProof w:val="0"/>
+          <w:sz w:val="24"/>
+          <w:szCs w:val="24"/>
+          <w:u w:val="none"/>
+          <w:lang w:val="en-US"/>
+        </w:rPr>
+        <w:t xml:space="preserve"> </w:t>
+      </w:r>
+      <w:r>
+        <w:rPr>
+          <w:rFonts w:ascii="Arial" w:hAnsi="Arial" w:eastAsia="Arial" w:cs="Arial"/>
+          <w:b w:val="0"/>
+          <w:bCs w:val="0"/>
+          <w:strike w:val="0"/>
+          <w:dstrike w:val="0"/>
+          <w:noProof w:val="0"/>
+          <w:sz w:val="24"/>
+          <w:szCs w:val="24"/>
+          <w:u w:val="none"/>
+          <w:lang w:val="en-US"/>
+        </w:rPr>
+        <w:t>fermentação</w:t>
+      </w:r>
+      <w:r>
+        <w:rPr>
+          <w:rFonts w:ascii="Arial" w:hAnsi="Arial" w:eastAsia="Arial" w:cs="Arial"/>
+          <w:b w:val="0"/>
+          <w:bCs w:val="0"/>
+          <w:strike w:val="0"/>
+          <w:dstrike w:val="0"/>
+          <w:noProof w:val="0"/>
+          <w:sz w:val="24"/>
+          <w:szCs w:val="24"/>
+          <w:u w:val="none"/>
+          <w:lang w:val="en-US"/>
+        </w:rPr>
+        <w:t xml:space="preserve">. Ele </w:t>
+      </w:r>
+      <w:r>
+        <w:rPr>
+          <w:rFonts w:ascii="Arial" w:hAnsi="Arial" w:eastAsia="Arial" w:cs="Arial"/>
+          <w:b w:val="0"/>
+          <w:bCs w:val="0"/>
+          <w:strike w:val="0"/>
+          <w:dstrike w:val="0"/>
+          <w:noProof w:val="0"/>
+          <w:sz w:val="24"/>
+          <w:szCs w:val="24"/>
+          <w:u w:val="none"/>
+          <w:lang w:val="en-US"/>
+        </w:rPr>
+        <w:t>deve</w:t>
+      </w:r>
+      <w:r>
+        <w:rPr>
+          <w:rFonts w:ascii="Arial" w:hAnsi="Arial" w:eastAsia="Arial" w:cs="Arial"/>
+          <w:b w:val="0"/>
+          <w:bCs w:val="0"/>
+          <w:strike w:val="0"/>
+          <w:dstrike w:val="0"/>
+          <w:noProof w:val="0"/>
+          <w:sz w:val="24"/>
+          <w:szCs w:val="24"/>
+          <w:u w:val="none"/>
+          <w:lang w:val="en-US"/>
+        </w:rPr>
+        <w:t xml:space="preserve"> ser </w:t>
+      </w:r>
+      <w:r>
+        <w:rPr>
+          <w:rFonts w:ascii="Arial" w:hAnsi="Arial" w:eastAsia="Arial" w:cs="Arial"/>
+          <w:b w:val="0"/>
+          <w:bCs w:val="0"/>
+          <w:strike w:val="0"/>
+          <w:dstrike w:val="0"/>
+          <w:noProof w:val="0"/>
+          <w:sz w:val="24"/>
+          <w:szCs w:val="24"/>
+          <w:u w:val="none"/>
+          <w:lang w:val="en-US"/>
+        </w:rPr>
+        <w:t>inserido</w:t>
+      </w:r>
+      <w:r>
+        <w:rPr>
+          <w:rFonts w:ascii="Arial" w:hAnsi="Arial" w:eastAsia="Arial" w:cs="Arial"/>
+          <w:b w:val="0"/>
+          <w:bCs w:val="0"/>
+          <w:strike w:val="0"/>
+          <w:dstrike w:val="0"/>
+          <w:noProof w:val="0"/>
+          <w:sz w:val="24"/>
+          <w:szCs w:val="24"/>
+          <w:u w:val="none"/>
+          <w:lang w:val="en-US"/>
+        </w:rPr>
+        <w:t xml:space="preserve"> </w:t>
+      </w:r>
+      <w:r>
+        <w:rPr>
+          <w:rFonts w:ascii="Arial" w:hAnsi="Arial" w:eastAsia="Arial" w:cs="Arial"/>
+          <w:b w:val="0"/>
+          <w:bCs w:val="0"/>
+          <w:strike w:val="0"/>
+          <w:dstrike w:val="0"/>
+          <w:noProof w:val="0"/>
+          <w:sz w:val="24"/>
+          <w:szCs w:val="24"/>
+          <w:u w:val="none"/>
+          <w:lang w:val="en-US"/>
+        </w:rPr>
+        <w:t>obrigatoriamente</w:t>
+      </w:r>
+      <w:r>
+        <w:rPr>
+          <w:rFonts w:ascii="Arial" w:hAnsi="Arial" w:eastAsia="Arial" w:cs="Arial"/>
+          <w:b w:val="0"/>
+          <w:bCs w:val="0"/>
+          <w:strike w:val="0"/>
+          <w:dstrike w:val="0"/>
+          <w:noProof w:val="0"/>
+          <w:sz w:val="24"/>
+          <w:szCs w:val="24"/>
+          <w:u w:val="none"/>
+          <w:lang w:val="en-US"/>
+        </w:rPr>
+        <w:t xml:space="preserve"> </w:t>
+      </w:r>
+      <w:r>
+        <w:rPr>
+          <w:rFonts w:ascii="Arial" w:hAnsi="Arial" w:eastAsia="Arial" w:cs="Arial"/>
+          <w:b w:val="0"/>
+          <w:bCs w:val="0"/>
+          <w:strike w:val="0"/>
+          <w:dstrike w:val="0"/>
+          <w:noProof w:val="0"/>
+          <w:sz w:val="24"/>
+          <w:szCs w:val="24"/>
+          <w:u w:val="none"/>
+          <w:lang w:val="en-US"/>
+        </w:rPr>
+        <w:t>dentro</w:t>
+      </w:r>
+      <w:r>
+        <w:rPr>
+          <w:rFonts w:ascii="Arial" w:hAnsi="Arial" w:eastAsia="Arial" w:cs="Arial"/>
+          <w:b w:val="0"/>
+          <w:bCs w:val="0"/>
+          <w:strike w:val="0"/>
+          <w:dstrike w:val="0"/>
+          <w:noProof w:val="0"/>
+          <w:sz w:val="24"/>
+          <w:szCs w:val="24"/>
+          <w:u w:val="none"/>
+          <w:lang w:val="en-US"/>
+        </w:rPr>
+        <w:t xml:space="preserve"> de um </w:t>
+      </w:r>
+      <w:r>
+        <w:rPr>
+          <w:rFonts w:ascii="Arial" w:hAnsi="Arial" w:eastAsia="Arial" w:cs="Arial"/>
+          <w:b w:val="0"/>
+          <w:bCs w:val="0"/>
+          <w:strike w:val="0"/>
+          <w:dstrike w:val="0"/>
+          <w:noProof w:val="0"/>
+          <w:sz w:val="24"/>
+          <w:szCs w:val="24"/>
+          <w:u w:val="none"/>
+          <w:lang w:val="en-US"/>
+        </w:rPr>
+        <w:t>poço</w:t>
+      </w:r>
+      <w:r>
+        <w:rPr>
+          <w:rFonts w:ascii="Arial" w:hAnsi="Arial" w:eastAsia="Arial" w:cs="Arial"/>
+          <w:b w:val="0"/>
+          <w:bCs w:val="0"/>
+          <w:strike w:val="0"/>
+          <w:dstrike w:val="0"/>
+          <w:noProof w:val="0"/>
+          <w:sz w:val="24"/>
+          <w:szCs w:val="24"/>
+          <w:u w:val="none"/>
+          <w:lang w:val="en-US"/>
+        </w:rPr>
+        <w:t xml:space="preserve"> </w:t>
+      </w:r>
+      <w:r>
+        <w:rPr>
+          <w:rFonts w:ascii="Arial" w:hAnsi="Arial" w:eastAsia="Arial" w:cs="Arial"/>
+          <w:b w:val="0"/>
+          <w:bCs w:val="0"/>
+          <w:strike w:val="0"/>
+          <w:dstrike w:val="0"/>
+          <w:noProof w:val="0"/>
+          <w:sz w:val="24"/>
+          <w:szCs w:val="24"/>
+          <w:u w:val="none"/>
+          <w:lang w:val="en-US"/>
+        </w:rPr>
+        <w:t>termométrico</w:t>
+      </w:r>
+      <w:r>
+        <w:rPr>
+          <w:rFonts w:ascii="Arial" w:hAnsi="Arial" w:eastAsia="Arial" w:cs="Arial"/>
+          <w:b w:val="0"/>
+          <w:bCs w:val="0"/>
+          <w:strike w:val="0"/>
+          <w:dstrike w:val="0"/>
+          <w:noProof w:val="0"/>
+          <w:sz w:val="24"/>
+          <w:szCs w:val="24"/>
+          <w:u w:val="none"/>
+          <w:lang w:val="en-US"/>
+        </w:rPr>
+        <w:t xml:space="preserve"> </w:t>
+      </w:r>
+      <w:r>
+        <w:rPr>
+          <w:rFonts w:ascii="Arial" w:hAnsi="Arial" w:eastAsia="Arial" w:cs="Arial"/>
+          <w:b w:val="0"/>
+          <w:bCs w:val="0"/>
+          <w:strike w:val="0"/>
+          <w:dstrike w:val="0"/>
+          <w:noProof w:val="0"/>
+          <w:sz w:val="24"/>
+          <w:szCs w:val="24"/>
+          <w:u w:val="none"/>
+          <w:lang w:val="en-US"/>
+        </w:rPr>
+        <w:t>selado</w:t>
+      </w:r>
+      <w:r>
+        <w:rPr>
+          <w:rFonts w:ascii="Arial" w:hAnsi="Arial" w:eastAsia="Arial" w:cs="Arial"/>
+          <w:b w:val="0"/>
+          <w:bCs w:val="0"/>
+          <w:strike w:val="0"/>
+          <w:dstrike w:val="0"/>
+          <w:noProof w:val="0"/>
+          <w:sz w:val="24"/>
+          <w:szCs w:val="24"/>
+          <w:u w:val="none"/>
+          <w:lang w:val="en-US"/>
+        </w:rPr>
+        <w:t xml:space="preserve">, </w:t>
+      </w:r>
+      <w:r>
+        <w:rPr>
+          <w:rFonts w:ascii="Arial" w:hAnsi="Arial" w:eastAsia="Arial" w:cs="Arial"/>
+          <w:b w:val="0"/>
+          <w:bCs w:val="0"/>
+          <w:strike w:val="0"/>
+          <w:dstrike w:val="0"/>
+          <w:noProof w:val="0"/>
+          <w:sz w:val="24"/>
+          <w:szCs w:val="24"/>
+          <w:u w:val="none"/>
+          <w:lang w:val="en-US"/>
+        </w:rPr>
+        <w:t>fixado</w:t>
+      </w:r>
+      <w:r>
+        <w:rPr>
+          <w:rFonts w:ascii="Arial" w:hAnsi="Arial" w:eastAsia="Arial" w:cs="Arial"/>
+          <w:b w:val="0"/>
+          <w:bCs w:val="0"/>
+          <w:strike w:val="0"/>
+          <w:dstrike w:val="0"/>
+          <w:noProof w:val="0"/>
+          <w:sz w:val="24"/>
+          <w:szCs w:val="24"/>
+          <w:u w:val="none"/>
+          <w:lang w:val="en-US"/>
+        </w:rPr>
+        <w:t xml:space="preserve"> </w:t>
+      </w:r>
+      <w:r>
+        <w:rPr>
+          <w:rFonts w:ascii="Arial" w:hAnsi="Arial" w:eastAsia="Arial" w:cs="Arial"/>
+          <w:b w:val="0"/>
+          <w:bCs w:val="0"/>
+          <w:strike w:val="0"/>
+          <w:dstrike w:val="0"/>
+          <w:noProof w:val="0"/>
+          <w:sz w:val="24"/>
+          <w:szCs w:val="24"/>
+          <w:u w:val="none"/>
+          <w:lang w:val="en-US"/>
+        </w:rPr>
+        <w:t>na</w:t>
+      </w:r>
+      <w:r>
+        <w:rPr>
+          <w:rFonts w:ascii="Arial" w:hAnsi="Arial" w:eastAsia="Arial" w:cs="Arial"/>
+          <w:b w:val="0"/>
+          <w:bCs w:val="0"/>
+          <w:strike w:val="0"/>
+          <w:dstrike w:val="0"/>
+          <w:noProof w:val="0"/>
+          <w:sz w:val="24"/>
+          <w:szCs w:val="24"/>
+          <w:u w:val="none"/>
+          <w:lang w:val="en-US"/>
+        </w:rPr>
+        <w:t xml:space="preserve"> </w:t>
+      </w:r>
+      <w:r>
+        <w:rPr>
+          <w:rFonts w:ascii="Arial" w:hAnsi="Arial" w:eastAsia="Arial" w:cs="Arial"/>
+          <w:b w:val="0"/>
+          <w:bCs w:val="0"/>
+          <w:strike w:val="0"/>
+          <w:dstrike w:val="0"/>
+          <w:noProof w:val="0"/>
+          <w:sz w:val="24"/>
+          <w:szCs w:val="24"/>
+          <w:u w:val="none"/>
+          <w:lang w:val="en-US"/>
+        </w:rPr>
+        <w:t>estrutura</w:t>
+      </w:r>
+      <w:r>
+        <w:rPr>
+          <w:rFonts w:ascii="Arial" w:hAnsi="Arial" w:eastAsia="Arial" w:cs="Arial"/>
+          <w:b w:val="0"/>
+          <w:bCs w:val="0"/>
+          <w:strike w:val="0"/>
+          <w:dstrike w:val="0"/>
+          <w:noProof w:val="0"/>
+          <w:sz w:val="24"/>
+          <w:szCs w:val="24"/>
+          <w:u w:val="none"/>
+          <w:lang w:val="en-US"/>
+        </w:rPr>
+        <w:t xml:space="preserve"> interna do </w:t>
+      </w:r>
+      <w:r>
+        <w:rPr>
+          <w:rFonts w:ascii="Arial" w:hAnsi="Arial" w:eastAsia="Arial" w:cs="Arial"/>
+          <w:b w:val="0"/>
+          <w:bCs w:val="0"/>
+          <w:strike w:val="0"/>
+          <w:dstrike w:val="0"/>
+          <w:noProof w:val="0"/>
+          <w:sz w:val="24"/>
+          <w:szCs w:val="24"/>
+          <w:u w:val="none"/>
+          <w:lang w:val="en-US"/>
+        </w:rPr>
+        <w:t>tanque</w:t>
+      </w:r>
+      <w:r>
+        <w:rPr>
+          <w:rFonts w:ascii="Arial" w:hAnsi="Arial" w:eastAsia="Arial" w:cs="Arial"/>
+          <w:b w:val="0"/>
+          <w:bCs w:val="0"/>
+          <w:strike w:val="0"/>
+          <w:dstrike w:val="0"/>
+          <w:noProof w:val="0"/>
+          <w:sz w:val="24"/>
+          <w:szCs w:val="24"/>
+          <w:u w:val="none"/>
+          <w:lang w:val="en-US"/>
+        </w:rPr>
+        <w:t xml:space="preserve"> (pp. 2, 5).</w:t>
+      </w:r>
+    </w:p>
+    <w:p>
+      <w:pPr>
+        <w:spacing w:before="0" w:beforeAutospacing="off" w:after="0" w:afterAutospacing="off"/>
+        <w:rPr>
+          <w:rFonts w:ascii="Arial" w:hAnsi="Arial" w:eastAsia="Arial" w:cs="Arial"/>
+          <w:b w:val="0"/>
+          <w:bCs w:val="0"/>
+          <w:strike w:val="0"/>
+          <w:dstrike w:val="0"/>
+          <w:noProof w:val="0"/>
+          <w:sz w:val="24"/>
+          <w:szCs w:val="24"/>
+          <w:u w:val="none"/>
+          <w:lang w:val="en-US"/>
+        </w:rPr>
+      </w:pPr>
+    </w:p>
+    <w:p>
+      <w:pPr>
+        <w:spacing w:before="360" w:beforeAutospacing="off" w:after="180" w:afterAutospacing="off"/>
+        <w:rPr>
+          <w:rFonts w:ascii="Arial" w:hAnsi="Arial" w:eastAsia="Arial" w:cs="Arial"/>
+          <w:b w:val="1"/>
+          <w:bCs w:val="1"/>
+          <w:strike w:val="0"/>
+          <w:dstrike w:val="0"/>
+          <w:noProof w:val="0"/>
+          <w:sz w:val="28"/>
+          <w:szCs w:val="28"/>
+          <w:u w:val="none"/>
+          <w:lang w:val="en-US"/>
+        </w:rPr>
+      </w:pPr>
+      <w:r>
+        <w:rPr>
+          <w:rFonts w:ascii="Arial" w:hAnsi="Arial" w:eastAsia="Arial" w:cs="Arial"/>
+          <w:b w:val="1"/>
+          <w:bCs w:val="1"/>
+          <w:strike w:val="0"/>
+          <w:dstrike w:val="0"/>
+          <w:noProof w:val="0"/>
+          <w:sz w:val="28"/>
+          <w:szCs w:val="28"/>
+          <w:u w:val="none"/>
+          <w:lang w:val="en-US"/>
+        </w:rPr>
+        <w:t>3. Pinagem do Sensor LM35</w:t>
+      </w:r>
+    </w:p>
+    <w:p>
+      <w:pPr>
+        <w:spacing w:before="180" w:beforeAutospacing="off" w:after="240" w:afterAutospacing="off"/>
+      </w:pPr>
+      <w:r>
+        <w:rPr>
+          <w:rFonts w:ascii="Arial" w:hAnsi="Arial" w:eastAsia="Arial" w:cs="Arial"/>
+          <w:b w:val="0"/>
+          <w:bCs w:val="0"/>
+          <w:strike w:val="0"/>
+          <w:dstrike w:val="0"/>
+          <w:noProof w:val="0"/>
+          <w:sz w:val="24"/>
+          <w:szCs w:val="24"/>
+          <w:u w:val="none"/>
+          <w:lang w:val="en-US"/>
+        </w:rPr>
+        <w:t>Olhando para a parte plana do sensor LM35 (com as letras viradas para si), da esquerda para a direita, os pinos são:</w:t>
+      </w:r>
+    </w:p>
+    <w:p>
+      <w:pPr>
+        <w:pStyle w:val="ListParagraph"/>
+        <w:numPr>
+          <w:ilvl w:val="0"/>
+          <w:numId w:val="20"/>
+        </w:numPr>
+        <w:spacing w:before="180" w:beforeAutospacing="off" w:after="240" w:afterAutospacing="off"/>
+        <w:rPr>
+          <w:rFonts w:ascii="Arial" w:hAnsi="Arial" w:eastAsia="Arial" w:cs="Arial"/>
+          <w:b w:val="0"/>
+          <w:bCs w:val="0"/>
+          <w:strike w:val="0"/>
+          <w:dstrike w:val="0"/>
+          <w:noProof w:val="0"/>
+          <w:sz w:val="24"/>
+          <w:szCs w:val="24"/>
+          <w:u w:val="none"/>
+          <w:lang w:val="en-US"/>
+        </w:rPr>
+      </w:pPr>
+      <w:r>
+        <w:rPr>
+          <w:rFonts w:ascii="Arial" w:hAnsi="Arial" w:eastAsia="Arial" w:cs="Arial"/>
+          <w:b w:val="1"/>
+          <w:bCs w:val="1"/>
+          <w:strike w:val="0"/>
+          <w:dstrike w:val="0"/>
+          <w:noProof w:val="0"/>
+          <w:sz w:val="24"/>
+          <w:szCs w:val="24"/>
+          <w:u w:val="none"/>
+          <w:lang w:val="en-US"/>
+        </w:rPr>
+        <w:t>Pino 1 (VCC)</w:t>
+      </w:r>
+      <w:r>
+        <w:rPr>
+          <w:rFonts w:ascii="Arial" w:hAnsi="Arial" w:eastAsia="Arial" w:cs="Arial"/>
+          <w:b w:val="0"/>
+          <w:bCs w:val="0"/>
+          <w:strike w:val="0"/>
+          <w:dstrike w:val="0"/>
+          <w:noProof w:val="0"/>
+          <w:sz w:val="24"/>
+          <w:szCs w:val="24"/>
+          <w:u w:val="none"/>
+          <w:lang w:val="en-US"/>
+        </w:rPr>
+        <w:t>: Alimentação positiva (\(+5\text{V}\)).</w:t>
+      </w:r>
+    </w:p>
+    <w:p>
+      <w:pPr>
+        <w:pStyle w:val="ListParagraph"/>
+        <w:numPr>
+          <w:ilvl w:val="0"/>
+          <w:numId w:val="20"/>
+        </w:numPr>
+        <w:spacing w:before="180" w:beforeAutospacing="off" w:after="240" w:afterAutospacing="off"/>
+        <w:rPr>
+          <w:rFonts w:ascii="Arial" w:hAnsi="Arial" w:eastAsia="Arial" w:cs="Arial"/>
+          <w:b w:val="0"/>
+          <w:bCs w:val="0"/>
+          <w:strike w:val="0"/>
+          <w:dstrike w:val="0"/>
+          <w:noProof w:val="0"/>
+          <w:sz w:val="24"/>
+          <w:szCs w:val="24"/>
+          <w:u w:val="none"/>
+          <w:lang w:val="en-US"/>
+        </w:rPr>
+      </w:pPr>
+      <w:r>
+        <w:rPr>
+          <w:rFonts w:ascii="Arial" w:hAnsi="Arial" w:eastAsia="Arial" w:cs="Arial"/>
+          <w:b w:val="1"/>
+          <w:bCs w:val="1"/>
+          <w:strike w:val="0"/>
+          <w:dstrike w:val="0"/>
+          <w:noProof w:val="0"/>
+          <w:sz w:val="24"/>
+          <w:szCs w:val="24"/>
+          <w:u w:val="none"/>
+          <w:lang w:val="en-US"/>
+        </w:rPr>
+        <w:t>Pino 2 (Vout)</w:t>
+      </w:r>
+      <w:r>
+        <w:rPr>
+          <w:rFonts w:ascii="Arial" w:hAnsi="Arial" w:eastAsia="Arial" w:cs="Arial"/>
+          <w:b w:val="0"/>
+          <w:bCs w:val="0"/>
+          <w:strike w:val="0"/>
+          <w:dstrike w:val="0"/>
+          <w:noProof w:val="0"/>
+          <w:sz w:val="24"/>
+          <w:szCs w:val="24"/>
+          <w:u w:val="none"/>
+          <w:lang w:val="en-US"/>
+        </w:rPr>
+        <w:t>: Saída de sinal analógico.</w:t>
+      </w:r>
+    </w:p>
+    <w:p>
+      <w:pPr>
+        <w:pStyle w:val="ListParagraph"/>
+        <w:numPr>
+          <w:ilvl w:val="0"/>
+          <w:numId w:val="20"/>
+        </w:numPr>
+        <w:spacing w:before="180" w:beforeAutospacing="off" w:after="240" w:afterAutospacing="off"/>
+        <w:rPr>
+          <w:rFonts w:ascii="Arial" w:hAnsi="Arial" w:eastAsia="Arial" w:cs="Arial"/>
+          <w:b w:val="0"/>
+          <w:bCs w:val="0"/>
+          <w:strike w:val="0"/>
+          <w:dstrike w:val="0"/>
+          <w:noProof w:val="0"/>
+          <w:sz w:val="24"/>
+          <w:szCs w:val="24"/>
+          <w:u w:val="none"/>
+          <w:lang w:val="en-US"/>
+        </w:rPr>
+      </w:pPr>
+      <w:r>
+        <w:rPr>
+          <w:rFonts w:ascii="Arial" w:hAnsi="Arial" w:eastAsia="Arial" w:cs="Arial"/>
+          <w:b w:val="1"/>
+          <w:bCs w:val="1"/>
+          <w:strike w:val="0"/>
+          <w:dstrike w:val="0"/>
+          <w:noProof w:val="0"/>
+          <w:sz w:val="24"/>
+          <w:szCs w:val="24"/>
+          <w:u w:val="none"/>
+          <w:lang w:val="en-US"/>
+        </w:rPr>
+        <w:t>Pino 3 (GND)</w:t>
+      </w:r>
+      <w:r>
+        <w:rPr>
+          <w:rFonts w:ascii="Arial" w:hAnsi="Arial" w:eastAsia="Arial" w:cs="Arial"/>
+          <w:b w:val="0"/>
+          <w:bCs w:val="0"/>
+          <w:strike w:val="0"/>
+          <w:dstrike w:val="0"/>
+          <w:noProof w:val="0"/>
+          <w:sz w:val="24"/>
+          <w:szCs w:val="24"/>
+          <w:u w:val="none"/>
+          <w:lang w:val="en-US"/>
+        </w:rPr>
+        <w:t xml:space="preserve">: </w:t>
+      </w:r>
+      <w:r>
+        <w:rPr>
+          <w:rFonts w:ascii="Arial" w:hAnsi="Arial" w:eastAsia="Arial" w:cs="Arial"/>
+          <w:b w:val="0"/>
+          <w:bCs w:val="0"/>
+          <w:strike w:val="0"/>
+          <w:dstrike w:val="0"/>
+          <w:noProof w:val="0"/>
+          <w:sz w:val="24"/>
+          <w:szCs w:val="24"/>
+          <w:u w:val="none"/>
+          <w:lang w:val="en-US"/>
+        </w:rPr>
+        <w:t>Linha</w:t>
+      </w:r>
+      <w:r>
+        <w:rPr>
+          <w:rFonts w:ascii="Arial" w:hAnsi="Arial" w:eastAsia="Arial" w:cs="Arial"/>
+          <w:b w:val="0"/>
+          <w:bCs w:val="0"/>
+          <w:strike w:val="0"/>
+          <w:dstrike w:val="0"/>
+          <w:noProof w:val="0"/>
+          <w:sz w:val="24"/>
+          <w:szCs w:val="24"/>
+          <w:u w:val="none"/>
+          <w:lang w:val="en-US"/>
+        </w:rPr>
+        <w:t xml:space="preserve"> de terra (0V)</w:t>
+      </w:r>
+      <w:r>
+        <w:rPr>
+          <w:rFonts w:ascii="Arial" w:hAnsi="Arial" w:eastAsia="Arial" w:cs="Arial"/>
+          <w:b w:val="0"/>
+          <w:bCs w:val="0"/>
+          <w:strike w:val="0"/>
+          <w:dstrike w:val="0"/>
+          <w:noProof w:val="0"/>
+          <w:sz w:val="24"/>
+          <w:szCs w:val="24"/>
+          <w:u w:val="none"/>
+          <w:lang w:val="en-US"/>
+        </w:rPr>
+        <w:t>.</w:t>
+      </w:r>
+    </w:p>
+    <w:p>
+      <w:pPr>
+        <w:spacing w:before="0" w:beforeAutospacing="off" w:after="0" w:afterAutospacing="off"/>
+        <w:rPr>
+          <w:rFonts w:ascii="Arial" w:hAnsi="Arial" w:eastAsia="Arial" w:cs="Arial"/>
+          <w:b w:val="0"/>
+          <w:bCs w:val="0"/>
+          <w:strike w:val="0"/>
+          <w:dstrike w:val="0"/>
+          <w:noProof w:val="0"/>
+          <w:sz w:val="24"/>
+          <w:szCs w:val="24"/>
+          <w:u w:val="none"/>
+          <w:lang w:val="en-US"/>
+        </w:rPr>
+      </w:pPr>
+    </w:p>
+    <w:p>
+      <w:pPr>
+        <w:pStyle w:val="Normal"/>
+        <w:spacing w:before="180" w:beforeAutospacing="off" w:after="240" w:afterAutospacing="off"/>
+        <w:rPr>
+          <w:rFonts w:ascii="Arial" w:hAnsi="Arial" w:eastAsia="Arial" w:cs="Arial"/>
+          <w:b w:val="0"/>
+          <w:bCs w:val="0"/>
+          <w:strike w:val="0"/>
+          <w:dstrike w:val="0"/>
+          <w:noProof w:val="0"/>
+          <w:sz w:val="24"/>
+          <w:szCs w:val="24"/>
+          <w:u w:val="none"/>
+          <w:lang w:val="en-US"/>
+        </w:rPr>
+      </w:pPr>
+    </w:p>
+    <w:p>
+      <w:pPr>
+        <w:pStyle w:val="Normal"/>
+        <w:rPr>
+          <w:noProof w:val="0"/>
+          <w:lang w:val="en-US"/>
+        </w:rPr>
+      </w:pPr>
+    </w:p>
+    <w:p>
+      <w:pPr>
+        <w:pStyle w:val="ListParagraph"/>
+        <w:ind w:left="720"/>
+        <w:rPr>
+          <w:noProof w:val="0"/>
+          <w:lang w:val="en-US"/>
+        </w:rPr>
+      </w:pPr>
+    </w:p>
+    <w:p>
+      <w:pPr>
+        <w:pStyle w:val="Heading1"/>
+        <w:rPr>
+          <w:noProof w:val="0"/>
+          <w:lang w:val="en-US"/>
+        </w:rPr>
+      </w:pPr>
+      <w:r>
+        <w:rPr>
+          <w:noProof w:val="0"/>
+          <w:lang w:val="en-US"/>
+        </w:rPr>
+        <w:t>Instalação</w:t>
+      </w:r>
+      <w:r>
+        <w:rPr>
+          <w:noProof w:val="0"/>
+          <w:lang w:val="en-US"/>
+        </w:rPr>
+        <w:t xml:space="preserve"> do Software:</w:t>
       </w:r>
     </w:p>
     <w:p xmlns:wp14="http://schemas.microsoft.com/office/word/2010/wordml" wp14:paraId="16778CDC" wp14:textId="35BE5611">
@@ -2514,6 +3975,570 @@
 
 <file path=word/numbering.xml><?xml version="1.0" encoding="utf-8"?>
 <w:numbering xmlns:w="http://schemas.openxmlformats.org/wordprocessingml/2006/main">
+  <w:abstractNum xmlns:w="http://schemas.openxmlformats.org/wordprocessingml/2006/main" w:abstractNumId="20">
+    <w:nsid w:val="2c572f33"/>
+    <w:multiLevelType xmlns:w="http://schemas.openxmlformats.org/wordprocessingml/2006/main" w:val="hybridMultilevel"/>
+    <w:lvl xmlns:w="http://schemas.openxmlformats.org/wordprocessingml/2006/main" w:ilvl="0">
+      <w:start w:val="1"/>
+      <w:numFmt w:val="decimal"/>
+      <w:lvlText w:val="%1."/>
+      <w:lvlJc w:val="left"/>
+      <w:pPr>
+        <w:ind w:left="720" w:hanging="360"/>
+      </w:pPr>
+    </w:lvl>
+    <w:lvl xmlns:w="http://schemas.openxmlformats.org/wordprocessingml/2006/main" w:ilvl="1">
+      <w:start w:val="1"/>
+      <w:numFmt w:val="lowerLetter"/>
+      <w:lvlText w:val="%2."/>
+      <w:lvlJc w:val="left"/>
+      <w:pPr>
+        <w:ind w:left="1440" w:hanging="360"/>
+      </w:pPr>
+    </w:lvl>
+    <w:lvl xmlns:w="http://schemas.openxmlformats.org/wordprocessingml/2006/main" w:ilvl="2">
+      <w:start w:val="1"/>
+      <w:numFmt w:val="lowerRoman"/>
+      <w:lvlText w:val="%3."/>
+      <w:lvlJc w:val="right"/>
+      <w:pPr>
+        <w:ind w:left="2160" w:hanging="180"/>
+      </w:pPr>
+    </w:lvl>
+    <w:lvl xmlns:w="http://schemas.openxmlformats.org/wordprocessingml/2006/main" w:ilvl="3">
+      <w:start w:val="1"/>
+      <w:numFmt w:val="decimal"/>
+      <w:lvlText w:val="%4."/>
+      <w:lvlJc w:val="left"/>
+      <w:pPr>
+        <w:ind w:left="2880" w:hanging="360"/>
+      </w:pPr>
+    </w:lvl>
+    <w:lvl xmlns:w="http://schemas.openxmlformats.org/wordprocessingml/2006/main" w:ilvl="4">
+      <w:start w:val="1"/>
+      <w:numFmt w:val="lowerLetter"/>
+      <w:lvlText w:val="%5."/>
+      <w:lvlJc w:val="left"/>
+      <w:pPr>
+        <w:ind w:left="3600" w:hanging="360"/>
+      </w:pPr>
+    </w:lvl>
+    <w:lvl xmlns:w="http://schemas.openxmlformats.org/wordprocessingml/2006/main" w:ilvl="5">
+      <w:start w:val="1"/>
+      <w:numFmt w:val="lowerRoman"/>
+      <w:lvlText w:val="%6."/>
+      <w:lvlJc w:val="right"/>
+      <w:pPr>
+        <w:ind w:left="4320" w:hanging="180"/>
+      </w:pPr>
+    </w:lvl>
+    <w:lvl xmlns:w="http://schemas.openxmlformats.org/wordprocessingml/2006/main" w:ilvl="6">
+      <w:start w:val="1"/>
+      <w:numFmt w:val="decimal"/>
+      <w:lvlText w:val="%7."/>
+      <w:lvlJc w:val="left"/>
+      <w:pPr>
+        <w:ind w:left="5040" w:hanging="360"/>
+      </w:pPr>
+    </w:lvl>
+    <w:lvl xmlns:w="http://schemas.openxmlformats.org/wordprocessingml/2006/main" w:ilvl="7">
+      <w:start w:val="1"/>
+      <w:numFmt w:val="lowerLetter"/>
+      <w:lvlText w:val="%8."/>
+      <w:lvlJc w:val="left"/>
+      <w:pPr>
+        <w:ind w:left="5760" w:hanging="360"/>
+      </w:pPr>
+    </w:lvl>
+    <w:lvl xmlns:w="http://schemas.openxmlformats.org/wordprocessingml/2006/main" w:ilvl="8">
+      <w:start w:val="1"/>
+      <w:numFmt w:val="lowerRoman"/>
+      <w:lvlText w:val="%9."/>
+      <w:lvlJc w:val="right"/>
+      <w:pPr>
+        <w:ind w:left="6480" w:hanging="180"/>
+      </w:pPr>
+    </w:lvl>
+  </w:abstractNum>
+  <w:abstractNum xmlns:w="http://schemas.openxmlformats.org/wordprocessingml/2006/main" w:abstractNumId="19">
+    <w:nsid w:val="33661aa9"/>
+    <w:multiLevelType xmlns:w="http://schemas.openxmlformats.org/wordprocessingml/2006/main" w:val="hybridMultilevel"/>
+    <w:lvl xmlns:w="http://schemas.openxmlformats.org/wordprocessingml/2006/main" w:ilvl="0">
+      <w:start w:val="1"/>
+      <w:numFmt w:val="bullet"/>
+      <w:lvlText w:val=""/>
+      <w:lvlJc w:val="left"/>
+      <w:pPr>
+        <w:ind w:left="720" w:hanging="360"/>
+      </w:pPr>
+      <w:rPr>
+        <w:rFonts w:hint="default" w:ascii="Symbol" w:hAnsi="Symbol"/>
+      </w:rPr>
+    </w:lvl>
+    <w:lvl xmlns:w="http://schemas.openxmlformats.org/wordprocessingml/2006/main" w:ilvl="1">
+      <w:start w:val="1"/>
+      <w:numFmt w:val="bullet"/>
+      <w:lvlText w:val="o"/>
+      <w:lvlJc w:val="left"/>
+      <w:pPr>
+        <w:ind w:left="1440" w:hanging="360"/>
+      </w:pPr>
+      <w:rPr>
+        <w:rFonts w:hint="default" w:ascii="Courier New" w:hAnsi="Courier New"/>
+      </w:rPr>
+    </w:lvl>
+    <w:lvl xmlns:w="http://schemas.openxmlformats.org/wordprocessingml/2006/main" w:ilvl="2">
+      <w:start w:val="1"/>
+      <w:numFmt w:val="bullet"/>
+      <w:lvlText w:val=""/>
+      <w:lvlJc w:val="left"/>
+      <w:pPr>
+        <w:ind w:left="2160" w:hanging="360"/>
+      </w:pPr>
+      <w:rPr>
+        <w:rFonts w:hint="default" w:ascii="Wingdings" w:hAnsi="Wingdings"/>
+      </w:rPr>
+    </w:lvl>
+    <w:lvl xmlns:w="http://schemas.openxmlformats.org/wordprocessingml/2006/main" w:ilvl="3">
+      <w:start w:val="1"/>
+      <w:numFmt w:val="bullet"/>
+      <w:lvlText w:val=""/>
+      <w:lvlJc w:val="left"/>
+      <w:pPr>
+        <w:ind w:left="2880" w:hanging="360"/>
+      </w:pPr>
+      <w:rPr>
+        <w:rFonts w:hint="default" w:ascii="Symbol" w:hAnsi="Symbol"/>
+      </w:rPr>
+    </w:lvl>
+    <w:lvl xmlns:w="http://schemas.openxmlformats.org/wordprocessingml/2006/main" w:ilvl="4">
+      <w:start w:val="1"/>
+      <w:numFmt w:val="bullet"/>
+      <w:lvlText w:val="o"/>
+      <w:lvlJc w:val="left"/>
+      <w:pPr>
+        <w:ind w:left="3600" w:hanging="360"/>
+      </w:pPr>
+      <w:rPr>
+        <w:rFonts w:hint="default" w:ascii="Courier New" w:hAnsi="Courier New"/>
+      </w:rPr>
+    </w:lvl>
+    <w:lvl xmlns:w="http://schemas.openxmlformats.org/wordprocessingml/2006/main" w:ilvl="5">
+      <w:start w:val="1"/>
+      <w:numFmt w:val="bullet"/>
+      <w:lvlText w:val=""/>
+      <w:lvlJc w:val="left"/>
+      <w:pPr>
+        <w:ind w:left="4320" w:hanging="360"/>
+      </w:pPr>
+      <w:rPr>
+        <w:rFonts w:hint="default" w:ascii="Wingdings" w:hAnsi="Wingdings"/>
+      </w:rPr>
+    </w:lvl>
+    <w:lvl xmlns:w="http://schemas.openxmlformats.org/wordprocessingml/2006/main" w:ilvl="6">
+      <w:start w:val="1"/>
+      <w:numFmt w:val="bullet"/>
+      <w:lvlText w:val=""/>
+      <w:lvlJc w:val="left"/>
+      <w:pPr>
+        <w:ind w:left="5040" w:hanging="360"/>
+      </w:pPr>
+      <w:rPr>
+        <w:rFonts w:hint="default" w:ascii="Symbol" w:hAnsi="Symbol"/>
+      </w:rPr>
+    </w:lvl>
+    <w:lvl xmlns:w="http://schemas.openxmlformats.org/wordprocessingml/2006/main" w:ilvl="7">
+      <w:start w:val="1"/>
+      <w:numFmt w:val="bullet"/>
+      <w:lvlText w:val="o"/>
+      <w:lvlJc w:val="left"/>
+      <w:pPr>
+        <w:ind w:left="5760" w:hanging="360"/>
+      </w:pPr>
+      <w:rPr>
+        <w:rFonts w:hint="default" w:ascii="Courier New" w:hAnsi="Courier New"/>
+      </w:rPr>
+    </w:lvl>
+    <w:lvl xmlns:w="http://schemas.openxmlformats.org/wordprocessingml/2006/main" w:ilvl="8">
+      <w:start w:val="1"/>
+      <w:numFmt w:val="bullet"/>
+      <w:lvlText w:val=""/>
+      <w:lvlJc w:val="left"/>
+      <w:pPr>
+        <w:ind w:left="6480" w:hanging="360"/>
+      </w:pPr>
+      <w:rPr>
+        <w:rFonts w:hint="default" w:ascii="Wingdings" w:hAnsi="Wingdings"/>
+      </w:rPr>
+    </w:lvl>
+  </w:abstractNum>
+  <w:abstractNum xmlns:w="http://schemas.openxmlformats.org/wordprocessingml/2006/main" w:abstractNumId="18">
+    <w:nsid w:val="18939e77"/>
+    <w:multiLevelType xmlns:w="http://schemas.openxmlformats.org/wordprocessingml/2006/main" w:val="hybridMultilevel"/>
+    <w:lvl xmlns:w="http://schemas.openxmlformats.org/wordprocessingml/2006/main" w:ilvl="0">
+      <w:start w:val="1"/>
+      <w:numFmt w:val="decimal"/>
+      <w:lvlText w:val="%1."/>
+      <w:lvlJc w:val="left"/>
+      <w:pPr>
+        <w:ind w:left="720" w:hanging="360"/>
+      </w:pPr>
+    </w:lvl>
+    <w:lvl xmlns:w="http://schemas.openxmlformats.org/wordprocessingml/2006/main" w:ilvl="1">
+      <w:start w:val="1"/>
+      <w:numFmt w:val="lowerLetter"/>
+      <w:lvlText w:val="%2."/>
+      <w:lvlJc w:val="left"/>
+      <w:pPr>
+        <w:ind w:left="1440" w:hanging="360"/>
+      </w:pPr>
+    </w:lvl>
+    <w:lvl xmlns:w="http://schemas.openxmlformats.org/wordprocessingml/2006/main" w:ilvl="2">
+      <w:start w:val="1"/>
+      <w:numFmt w:val="lowerRoman"/>
+      <w:lvlText w:val="%3."/>
+      <w:lvlJc w:val="right"/>
+      <w:pPr>
+        <w:ind w:left="2160" w:hanging="180"/>
+      </w:pPr>
+    </w:lvl>
+    <w:lvl xmlns:w="http://schemas.openxmlformats.org/wordprocessingml/2006/main" w:ilvl="3">
+      <w:start w:val="1"/>
+      <w:numFmt w:val="decimal"/>
+      <w:lvlText w:val="%4."/>
+      <w:lvlJc w:val="left"/>
+      <w:pPr>
+        <w:ind w:left="2880" w:hanging="360"/>
+      </w:pPr>
+    </w:lvl>
+    <w:lvl xmlns:w="http://schemas.openxmlformats.org/wordprocessingml/2006/main" w:ilvl="4">
+      <w:start w:val="1"/>
+      <w:numFmt w:val="lowerLetter"/>
+      <w:lvlText w:val="%5."/>
+      <w:lvlJc w:val="left"/>
+      <w:pPr>
+        <w:ind w:left="3600" w:hanging="360"/>
+      </w:pPr>
+    </w:lvl>
+    <w:lvl xmlns:w="http://schemas.openxmlformats.org/wordprocessingml/2006/main" w:ilvl="5">
+      <w:start w:val="1"/>
+      <w:numFmt w:val="lowerRoman"/>
+      <w:lvlText w:val="%6."/>
+      <w:lvlJc w:val="right"/>
+      <w:pPr>
+        <w:ind w:left="4320" w:hanging="180"/>
+      </w:pPr>
+    </w:lvl>
+    <w:lvl xmlns:w="http://schemas.openxmlformats.org/wordprocessingml/2006/main" w:ilvl="6">
+      <w:start w:val="1"/>
+      <w:numFmt w:val="decimal"/>
+      <w:lvlText w:val="%7."/>
+      <w:lvlJc w:val="left"/>
+      <w:pPr>
+        <w:ind w:left="5040" w:hanging="360"/>
+      </w:pPr>
+    </w:lvl>
+    <w:lvl xmlns:w="http://schemas.openxmlformats.org/wordprocessingml/2006/main" w:ilvl="7">
+      <w:start w:val="1"/>
+      <w:numFmt w:val="lowerLetter"/>
+      <w:lvlText w:val="%8."/>
+      <w:lvlJc w:val="left"/>
+      <w:pPr>
+        <w:ind w:left="5760" w:hanging="360"/>
+      </w:pPr>
+    </w:lvl>
+    <w:lvl xmlns:w="http://schemas.openxmlformats.org/wordprocessingml/2006/main" w:ilvl="8">
+      <w:start w:val="1"/>
+      <w:numFmt w:val="lowerRoman"/>
+      <w:lvlText w:val="%9."/>
+      <w:lvlJc w:val="right"/>
+      <w:pPr>
+        <w:ind w:left="6480" w:hanging="180"/>
+      </w:pPr>
+    </w:lvl>
+  </w:abstractNum>
+  <w:abstractNum xmlns:w="http://schemas.openxmlformats.org/wordprocessingml/2006/main" w:abstractNumId="17">
+    <w:nsid w:val="774c6ba3"/>
+    <w:multiLevelType xmlns:w="http://schemas.openxmlformats.org/wordprocessingml/2006/main" w:val="hybridMultilevel"/>
+    <w:lvl xmlns:w="http://schemas.openxmlformats.org/wordprocessingml/2006/main" w:ilvl="0">
+      <w:start w:val="1"/>
+      <w:numFmt w:val="decimal"/>
+      <w:lvlText w:val="%1."/>
+      <w:lvlJc w:val="left"/>
+      <w:pPr>
+        <w:ind w:left="720" w:hanging="360"/>
+      </w:pPr>
+    </w:lvl>
+    <w:lvl xmlns:w="http://schemas.openxmlformats.org/wordprocessingml/2006/main" w:ilvl="1">
+      <w:start w:val="1"/>
+      <w:numFmt w:val="lowerLetter"/>
+      <w:lvlText w:val="%2."/>
+      <w:lvlJc w:val="left"/>
+      <w:pPr>
+        <w:ind w:left="1440" w:hanging="360"/>
+      </w:pPr>
+    </w:lvl>
+    <w:lvl xmlns:w="http://schemas.openxmlformats.org/wordprocessingml/2006/main" w:ilvl="2">
+      <w:start w:val="1"/>
+      <w:numFmt w:val="lowerRoman"/>
+      <w:lvlText w:val="%3."/>
+      <w:lvlJc w:val="right"/>
+      <w:pPr>
+        <w:ind w:left="2160" w:hanging="180"/>
+      </w:pPr>
+    </w:lvl>
+    <w:lvl xmlns:w="http://schemas.openxmlformats.org/wordprocessingml/2006/main" w:ilvl="3">
+      <w:start w:val="1"/>
+      <w:numFmt w:val="decimal"/>
+      <w:lvlText w:val="%4."/>
+      <w:lvlJc w:val="left"/>
+      <w:pPr>
+        <w:ind w:left="2880" w:hanging="360"/>
+      </w:pPr>
+    </w:lvl>
+    <w:lvl xmlns:w="http://schemas.openxmlformats.org/wordprocessingml/2006/main" w:ilvl="4">
+      <w:start w:val="1"/>
+      <w:numFmt w:val="lowerLetter"/>
+      <w:lvlText w:val="%5."/>
+      <w:lvlJc w:val="left"/>
+      <w:pPr>
+        <w:ind w:left="3600" w:hanging="360"/>
+      </w:pPr>
+    </w:lvl>
+    <w:lvl xmlns:w="http://schemas.openxmlformats.org/wordprocessingml/2006/main" w:ilvl="5">
+      <w:start w:val="1"/>
+      <w:numFmt w:val="lowerRoman"/>
+      <w:lvlText w:val="%6."/>
+      <w:lvlJc w:val="right"/>
+      <w:pPr>
+        <w:ind w:left="4320" w:hanging="180"/>
+      </w:pPr>
+    </w:lvl>
+    <w:lvl xmlns:w="http://schemas.openxmlformats.org/wordprocessingml/2006/main" w:ilvl="6">
+      <w:start w:val="1"/>
+      <w:numFmt w:val="decimal"/>
+      <w:lvlText w:val="%7."/>
+      <w:lvlJc w:val="left"/>
+      <w:pPr>
+        <w:ind w:left="5040" w:hanging="360"/>
+      </w:pPr>
+    </w:lvl>
+    <w:lvl xmlns:w="http://schemas.openxmlformats.org/wordprocessingml/2006/main" w:ilvl="7">
+      <w:start w:val="1"/>
+      <w:numFmt w:val="lowerLetter"/>
+      <w:lvlText w:val="%8."/>
+      <w:lvlJc w:val="left"/>
+      <w:pPr>
+        <w:ind w:left="5760" w:hanging="360"/>
+      </w:pPr>
+    </w:lvl>
+    <w:lvl xmlns:w="http://schemas.openxmlformats.org/wordprocessingml/2006/main" w:ilvl="8">
+      <w:start w:val="1"/>
+      <w:numFmt w:val="lowerRoman"/>
+      <w:lvlText w:val="%9."/>
+      <w:lvlJc w:val="right"/>
+      <w:pPr>
+        <w:ind w:left="6480" w:hanging="180"/>
+      </w:pPr>
+    </w:lvl>
+  </w:abstractNum>
+  <w:abstractNum xmlns:w="http://schemas.openxmlformats.org/wordprocessingml/2006/main" w:abstractNumId="16">
+    <w:nsid w:val="51159980"/>
+    <w:multiLevelType xmlns:w="http://schemas.openxmlformats.org/wordprocessingml/2006/main" w:val="hybridMultilevel"/>
+    <w:lvl xmlns:w="http://schemas.openxmlformats.org/wordprocessingml/2006/main" w:ilvl="0">
+      <w:start w:val="1"/>
+      <w:numFmt w:val="bullet"/>
+      <w:lvlText w:val=""/>
+      <w:lvlJc w:val="left"/>
+      <w:pPr>
+        <w:ind w:left="720" w:hanging="360"/>
+      </w:pPr>
+      <w:rPr>
+        <w:rFonts w:hint="default" w:ascii="Symbol" w:hAnsi="Symbol"/>
+      </w:rPr>
+    </w:lvl>
+    <w:lvl xmlns:w="http://schemas.openxmlformats.org/wordprocessingml/2006/main" w:ilvl="1">
+      <w:start w:val="1"/>
+      <w:numFmt w:val="bullet"/>
+      <w:lvlText w:val="o"/>
+      <w:lvlJc w:val="left"/>
+      <w:pPr>
+        <w:ind w:left="1440" w:hanging="360"/>
+      </w:pPr>
+      <w:rPr>
+        <w:rFonts w:hint="default" w:ascii="Courier New" w:hAnsi="Courier New"/>
+      </w:rPr>
+    </w:lvl>
+    <w:lvl xmlns:w="http://schemas.openxmlformats.org/wordprocessingml/2006/main" w:ilvl="2">
+      <w:start w:val="1"/>
+      <w:numFmt w:val="bullet"/>
+      <w:lvlText w:val=""/>
+      <w:lvlJc w:val="left"/>
+      <w:pPr>
+        <w:ind w:left="2160" w:hanging="360"/>
+      </w:pPr>
+      <w:rPr>
+        <w:rFonts w:hint="default" w:ascii="Wingdings" w:hAnsi="Wingdings"/>
+      </w:rPr>
+    </w:lvl>
+    <w:lvl xmlns:w="http://schemas.openxmlformats.org/wordprocessingml/2006/main" w:ilvl="3">
+      <w:start w:val="1"/>
+      <w:numFmt w:val="bullet"/>
+      <w:lvlText w:val=""/>
+      <w:lvlJc w:val="left"/>
+      <w:pPr>
+        <w:ind w:left="2880" w:hanging="360"/>
+      </w:pPr>
+      <w:rPr>
+        <w:rFonts w:hint="default" w:ascii="Symbol" w:hAnsi="Symbol"/>
+      </w:rPr>
+    </w:lvl>
+    <w:lvl xmlns:w="http://schemas.openxmlformats.org/wordprocessingml/2006/main" w:ilvl="4">
+      <w:start w:val="1"/>
+      <w:numFmt w:val="bullet"/>
+      <w:lvlText w:val="o"/>
+      <w:lvlJc w:val="left"/>
+      <w:pPr>
+        <w:ind w:left="3600" w:hanging="360"/>
+      </w:pPr>
+      <w:rPr>
+        <w:rFonts w:hint="default" w:ascii="Courier New" w:hAnsi="Courier New"/>
+      </w:rPr>
+    </w:lvl>
+    <w:lvl xmlns:w="http://schemas.openxmlformats.org/wordprocessingml/2006/main" w:ilvl="5">
+      <w:start w:val="1"/>
+      <w:numFmt w:val="bullet"/>
+      <w:lvlText w:val=""/>
+      <w:lvlJc w:val="left"/>
+      <w:pPr>
+        <w:ind w:left="4320" w:hanging="360"/>
+      </w:pPr>
+      <w:rPr>
+        <w:rFonts w:hint="default" w:ascii="Wingdings" w:hAnsi="Wingdings"/>
+      </w:rPr>
+    </w:lvl>
+    <w:lvl xmlns:w="http://schemas.openxmlformats.org/wordprocessingml/2006/main" w:ilvl="6">
+      <w:start w:val="1"/>
+      <w:numFmt w:val="bullet"/>
+      <w:lvlText w:val=""/>
+      <w:lvlJc w:val="left"/>
+      <w:pPr>
+        <w:ind w:left="5040" w:hanging="360"/>
+      </w:pPr>
+      <w:rPr>
+        <w:rFonts w:hint="default" w:ascii="Symbol" w:hAnsi="Symbol"/>
+      </w:rPr>
+    </w:lvl>
+    <w:lvl xmlns:w="http://schemas.openxmlformats.org/wordprocessingml/2006/main" w:ilvl="7">
+      <w:start w:val="1"/>
+      <w:numFmt w:val="bullet"/>
+      <w:lvlText w:val="o"/>
+      <w:lvlJc w:val="left"/>
+      <w:pPr>
+        <w:ind w:left="5760" w:hanging="360"/>
+      </w:pPr>
+      <w:rPr>
+        <w:rFonts w:hint="default" w:ascii="Courier New" w:hAnsi="Courier New"/>
+      </w:rPr>
+    </w:lvl>
+    <w:lvl xmlns:w="http://schemas.openxmlformats.org/wordprocessingml/2006/main" w:ilvl="8">
+      <w:start w:val="1"/>
+      <w:numFmt w:val="bullet"/>
+      <w:lvlText w:val=""/>
+      <w:lvlJc w:val="left"/>
+      <w:pPr>
+        <w:ind w:left="6480" w:hanging="360"/>
+      </w:pPr>
+      <w:rPr>
+        <w:rFonts w:hint="default" w:ascii="Wingdings" w:hAnsi="Wingdings"/>
+      </w:rPr>
+    </w:lvl>
+  </w:abstractNum>
+  <w:abstractNum xmlns:w="http://schemas.openxmlformats.org/wordprocessingml/2006/main" w:abstractNumId="15">
+    <w:nsid w:val="4d6c0c53"/>
+    <w:multiLevelType xmlns:w="http://schemas.openxmlformats.org/wordprocessingml/2006/main" w:val="hybridMultilevel"/>
+    <w:lvl xmlns:w="http://schemas.openxmlformats.org/wordprocessingml/2006/main" w:ilvl="0">
+      <w:start w:val="1"/>
+      <w:numFmt w:val="decimal"/>
+      <w:lvlText w:val="%1."/>
+      <w:lvlJc w:val="left"/>
+      <w:pPr>
+        <w:ind w:left="720" w:hanging="360"/>
+      </w:pPr>
+    </w:lvl>
+    <w:lvl xmlns:w="http://schemas.openxmlformats.org/wordprocessingml/2006/main" w:ilvl="1">
+      <w:start w:val="1"/>
+      <w:numFmt w:val="lowerLetter"/>
+      <w:lvlText w:val="%2."/>
+      <w:lvlJc w:val="left"/>
+      <w:pPr>
+        <w:ind w:left="1440" w:hanging="360"/>
+      </w:pPr>
+    </w:lvl>
+    <w:lvl xmlns:w="http://schemas.openxmlformats.org/wordprocessingml/2006/main" w:ilvl="2">
+      <w:start w:val="1"/>
+      <w:numFmt w:val="lowerRoman"/>
+      <w:lvlText w:val="%3."/>
+      <w:lvlJc w:val="right"/>
+      <w:pPr>
+        <w:ind w:left="2160" w:hanging="180"/>
+      </w:pPr>
+    </w:lvl>
+    <w:lvl xmlns:w="http://schemas.openxmlformats.org/wordprocessingml/2006/main" w:ilvl="3">
+      <w:start w:val="1"/>
+      <w:numFmt w:val="decimal"/>
+      <w:lvlText w:val="%4."/>
+      <w:lvlJc w:val="left"/>
+      <w:pPr>
+        <w:ind w:left="2880" w:hanging="360"/>
+      </w:pPr>
+    </w:lvl>
+    <w:lvl xmlns:w="http://schemas.openxmlformats.org/wordprocessingml/2006/main" w:ilvl="4">
+      <w:start w:val="1"/>
+      <w:numFmt w:val="lowerLetter"/>
+      <w:lvlText w:val="%5."/>
+      <w:lvlJc w:val="left"/>
+      <w:pPr>
+        <w:ind w:left="3600" w:hanging="360"/>
+      </w:pPr>
+    </w:lvl>
+    <w:lvl xmlns:w="http://schemas.openxmlformats.org/wordprocessingml/2006/main" w:ilvl="5">
+      <w:start w:val="1"/>
+      <w:numFmt w:val="lowerRoman"/>
+      <w:lvlText w:val="%6."/>
+      <w:lvlJc w:val="right"/>
+      <w:pPr>
+        <w:ind w:left="4320" w:hanging="180"/>
+      </w:pPr>
+    </w:lvl>
+    <w:lvl xmlns:w="http://schemas.openxmlformats.org/wordprocessingml/2006/main" w:ilvl="6">
+      <w:start w:val="1"/>
+      <w:numFmt w:val="decimal"/>
+      <w:lvlText w:val="%7."/>
+      <w:lvlJc w:val="left"/>
+      <w:pPr>
+        <w:ind w:left="5040" w:hanging="360"/>
+      </w:pPr>
+    </w:lvl>
+    <w:lvl xmlns:w="http://schemas.openxmlformats.org/wordprocessingml/2006/main" w:ilvl="7">
+      <w:start w:val="1"/>
+      <w:numFmt w:val="lowerLetter"/>
+      <w:lvlText w:val="%8."/>
+      <w:lvlJc w:val="left"/>
+      <w:pPr>
+        <w:ind w:left="5760" w:hanging="360"/>
+      </w:pPr>
+    </w:lvl>
+    <w:lvl xmlns:w="http://schemas.openxmlformats.org/wordprocessingml/2006/main" w:ilvl="8">
+      <w:start w:val="1"/>
+      <w:numFmt w:val="lowerRoman"/>
+      <w:lvlText w:val="%9."/>
+      <w:lvlJc w:val="right"/>
+      <w:pPr>
+        <w:ind w:left="6480" w:hanging="180"/>
+      </w:pPr>
+    </w:lvl>
+  </w:abstractNum>
   <w:abstractNum xmlns:w="http://schemas.openxmlformats.org/wordprocessingml/2006/main" w:abstractNumId="14">
     <w:nsid w:val="5d10c7b3"/>
     <w:multiLevelType xmlns:w="http://schemas.openxmlformats.org/wordprocessingml/2006/main" w:val="hybridMultilevel"/>
@@ -4082,6 +6107,24 @@
       </w:rPr>
     </w:lvl>
   </w:abstractNum>
+  <w:num w:numId="20">
+    <w:abstractNumId w:val="20"/>
+  </w:num>
+  <w:num w:numId="19">
+    <w:abstractNumId w:val="19"/>
+  </w:num>
+  <w:num w:numId="18">
+    <w:abstractNumId w:val="18"/>
+  </w:num>
+  <w:num w:numId="17">
+    <w:abstractNumId w:val="17"/>
+  </w:num>
+  <w:num w:numId="16">
+    <w:abstractNumId w:val="16"/>
+  </w:num>
+  <w:num w:numId="15">
+    <w:abstractNumId w:val="15"/>
+  </w:num>
   <w:num w:numId="14">
     <w:abstractNumId w:val="14"/>
   </w:num>

</xml_diff>